<commit_message>
Sync Plan_fen 2026-10-29 23:34
</commit_message>
<xml_diff>
--- a/Plan_fen/研究計畫提示詞案例.docx
+++ b/Plan_fen/研究計畫提示詞案例.docx
@@ -846,7 +846,6 @@
         <w:spacing w:before="240" w:after="240"/>
         <w:ind w:leftChars="0"/>
         <w:rPr>
-          <w:rFonts w:hint="eastAsia"/>
           <w:sz w:val="23"/>
           <w:szCs w:val="23"/>
         </w:rPr>
@@ -865,10 +864,26 @@
       <w:pPr>
         <w:spacing w:before="240" w:after="240"/>
         <w:rPr>
+          <w:sz w:val="23"/>
+          <w:szCs w:val="23"/>
+        </w:rPr>
+      </w:pPr>
+      <w:r>
+        <w:rPr>
           <w:rFonts w:hint="eastAsia"/>
           <w:sz w:val="23"/>
           <w:szCs w:val="23"/>
         </w:rPr>
+        <w:t>1.後續問題的編修請依照上傳檔案的內容為依據（不要拿先前產出的計劃來編修），適當修改前後語意或作者忽略掉的地方；所有經過新的編修內容一律用螢光hightline標示</w:t>
+      </w:r>
+    </w:p>
+    <w:p>
+      <w:pPr>
+        <w:spacing w:before="240" w:after="240"/>
+        <w:rPr>
+          <w:sz w:val="23"/>
+          <w:szCs w:val="23"/>
+        </w:rPr>
       </w:pPr>
       <w:r>
         <w:rPr>
@@ -876,17 +891,33 @@
           <w:sz w:val="23"/>
           <w:szCs w:val="23"/>
         </w:rPr>
-        <w:t>1.後續問題的編修請依照上傳檔案的內容為依據（不要拿先前產出的計劃來編修），適當修改前後語意或作者忽略掉的地方；所有經過新的編修內容一律用螢光hightline標示</w:t>
-      </w:r>
-    </w:p>
-    <w:p>
-      <w:pPr>
-        <w:spacing w:before="240" w:after="240"/>
+        <w:t>2.以上傳檔案的內容為依據，檢視並重新整理引用的參考文獻及文件末尾更新參考文獻的列表清單</w:t>
+      </w:r>
+    </w:p>
+    <w:p>
+      <w:pPr>
+        <w:spacing w:before="240" w:after="240"/>
+        <w:rPr>
+          <w:sz w:val="23"/>
+          <w:szCs w:val="23"/>
+        </w:rPr>
+      </w:pPr>
+      <w:r>
         <w:rPr>
           <w:rFonts w:hint="eastAsia"/>
           <w:sz w:val="23"/>
           <w:szCs w:val="23"/>
         </w:rPr>
+        <w:t>3.針對本計劃的「壹、研究計畫之背景及目的」中的「一、研究計畫之背景」內的（參考1.JPG圖片內容適當的項目中），增加各子項的論述並強化缺口順值得研究價值所在，所有各子項目增加的內容由你決定，希望這一章節能夠擴充到十頁（目前是到4.5頁）</w:t>
+      </w:r>
+    </w:p>
+    <w:p>
+      <w:pPr>
+        <w:spacing w:before="240" w:after="240"/>
+        <w:rPr>
+          <w:sz w:val="23"/>
+          <w:szCs w:val="23"/>
+        </w:rPr>
       </w:pPr>
       <w:r>
         <w:rPr>
@@ -894,17 +925,33 @@
           <w:sz w:val="23"/>
           <w:szCs w:val="23"/>
         </w:rPr>
-        <w:t>2.以上傳檔案的內容為依據，檢視並重新整理引用的參考文獻及文件末尾更新參考文獻的列表清單</w:t>
-      </w:r>
-    </w:p>
-    <w:p>
-      <w:pPr>
-        <w:spacing w:before="240" w:after="240"/>
+        <w:t>4.目前計劃內有關「四、國內外相關之文獻探討」需要再補充論述，無論是以再增加擴充文獻來源或者重組、補充現有論述均可，除了再增加此章節頁數約5頁外，所編修的內容不要為了增加頁數而虛擬論述、必須言之有物、引經據典</w:t>
+      </w:r>
+    </w:p>
+    <w:p>
+      <w:pPr>
+        <w:spacing w:before="240" w:after="240"/>
+        <w:rPr>
+          <w:sz w:val="23"/>
+          <w:szCs w:val="23"/>
+        </w:rPr>
+      </w:pPr>
+      <w:r>
         <w:rPr>
           <w:rFonts w:hint="eastAsia"/>
           <w:sz w:val="23"/>
           <w:szCs w:val="23"/>
         </w:rPr>
+        <w:t>5.所有的圖、表均必須能夠讓使用者進行全功能編輯，目前無法針對圖、表的內容進行移動、重組、格式複製，請恢復到能在docx格式中，能夠完全編輯控制的能力</w:t>
+      </w:r>
+    </w:p>
+    <w:p>
+      <w:pPr>
+        <w:spacing w:before="240" w:after="240"/>
+        <w:rPr>
+          <w:sz w:val="23"/>
+          <w:szCs w:val="23"/>
+        </w:rPr>
       </w:pPr>
       <w:r>
         <w:rPr>
@@ -912,53 +959,104 @@
           <w:sz w:val="23"/>
           <w:szCs w:val="23"/>
         </w:rPr>
-        <w:t>3.針對本計劃的「壹、研究計畫之背景及目的」中的「一、研究計畫之背景」內的（參考1.JPG圖片內容適當的項目中），增加各子項的論述並強化缺口順值得研究價值所在，所有各子項目增加的內容由你決定，希望這一章節能夠擴充到十頁（目前是到4.5頁）</w:t>
-      </w:r>
-    </w:p>
-    <w:p>
-      <w:pPr>
-        <w:spacing w:before="240" w:after="240"/>
+        <w:t>6.「肆、參考文獻」中所有的符號「–」，改以半形「-」取代</w:t>
+      </w:r>
+    </w:p>
+    <w:p>
+      <w:pPr>
+        <w:spacing w:before="240" w:after="240"/>
+        <w:rPr>
+          <w:sz w:val="23"/>
+          <w:szCs w:val="23"/>
+        </w:rPr>
+      </w:pPr>
+      <w:r>
         <w:rPr>
           <w:rFonts w:hint="eastAsia"/>
           <w:sz w:val="23"/>
           <w:szCs w:val="23"/>
         </w:rPr>
-      </w:pPr>
+        <w:t>7.「表 4　近五年代表性實證研究之缺口矩陣」中的第一個欄位「研究文獻」內容，顯示方式請參考「肆、參考文獻」中，作者的表示方式修正</w:t>
+      </w:r>
+    </w:p>
+    <w:p>
+      <w:pPr>
+        <w:spacing w:before="240" w:after="240"/>
+        <w:rPr>
+          <w:sz w:val="23"/>
+          <w:szCs w:val="23"/>
+        </w:rPr>
+      </w:pPr>
+      <w:r>
+        <w:rPr>
+          <w:sz w:val="23"/>
+          <w:szCs w:val="23"/>
+        </w:rPr>
+        <w:t>8.</w:t>
+      </w:r>
       <w:r>
         <w:rPr>
           <w:rFonts w:hint="eastAsia"/>
           <w:sz w:val="23"/>
           <w:szCs w:val="23"/>
         </w:rPr>
-        <w:t>4.目前計劃內有關「四、國內外相關之文獻探討」需要再補充論述，無論是以再增加擴充文獻來源或者重組、補充現有論述均可，除了再增加此章節頁數約5頁外，所編修的內容不要為了增加頁數而虛擬論述、必須言之有物、引經據典</w:t>
-      </w:r>
-    </w:p>
-    <w:p>
-      <w:pPr>
-        <w:spacing w:before="240" w:after="240"/>
+        <w:t>所有圖、表的順序編號以全文上下順序重新編排、並非跟隨章節編號而定，如「表</w:t>
+      </w:r>
+      <w:r>
+        <w:rPr>
+          <w:sz w:val="23"/>
+          <w:szCs w:val="23"/>
+        </w:rPr>
+        <w:t xml:space="preserve"> 4</w:t>
+      </w:r>
+      <w:r>
         <w:rPr>
           <w:rFonts w:hint="eastAsia"/>
           <w:sz w:val="23"/>
           <w:szCs w:val="23"/>
         </w:rPr>
-      </w:pPr>
+        <w:t xml:space="preserve">　近五年代表性實證研究之缺口矩陣」是文中的第二張表，就應該改為「表</w:t>
+      </w:r>
+      <w:r>
+        <w:rPr>
+          <w:sz w:val="23"/>
+          <w:szCs w:val="23"/>
+        </w:rPr>
+        <w:t xml:space="preserve"> 2</w:t>
+      </w:r>
       <w:r>
         <w:rPr>
           <w:rFonts w:hint="eastAsia"/>
           <w:sz w:val="23"/>
           <w:szCs w:val="23"/>
         </w:rPr>
-        <w:t>5.所有的圖、表均必須能夠讓使用者進行全功能編輯，目前無法針對圖、表的內容進行移動、重組、格式複製，請恢復到能在docx格式中，能夠完全編輯控制的能力</w:t>
-      </w:r>
-    </w:p>
-    <w:p>
-      <w:pPr>
-        <w:spacing w:before="240" w:after="240"/>
+        <w:t xml:space="preserve">　近五年代表性實證研究之缺口矩陣」才對，文案內所有其他表及圖的順序編號請一倂修正（包含本文引用的文字亦須一倂修正）</w:t>
+      </w:r>
+    </w:p>
+    <w:p>
+      <w:pPr>
+        <w:spacing w:before="240" w:after="240"/>
+        <w:rPr>
+          <w:sz w:val="23"/>
+          <w:szCs w:val="23"/>
+        </w:rPr>
+      </w:pPr>
+      <w:r>
         <w:rPr>
           <w:rFonts w:hint="eastAsia"/>
           <w:sz w:val="23"/>
           <w:szCs w:val="23"/>
         </w:rPr>
+        <w:t>再度重申所有編修的內容必須以上傳檔案：「11-1025-2335_兩年期研究計畫書-R4(OK).docx」為主，並且用螢光hightline標示所有有編修異動的內容；修改完成後重新產出新的計劃案、待下載文獻清單、各主題資料夾文獻數量及你所修改內容的重點摘要</w:t>
+      </w:r>
+    </w:p>
+    <w:p>
+      <w:pPr>
+        <w:spacing w:before="240" w:after="240"/>
+        <w:rPr>
+          <w:sz w:val="23"/>
+          <w:szCs w:val="23"/>
+        </w:rPr>
       </w:pPr>
       <w:r>
         <w:rPr>
@@ -966,156 +1064,38 @@
           <w:sz w:val="23"/>
           <w:szCs w:val="23"/>
         </w:rPr>
-        <w:t>6.「肆、參考文獻」中所有的符號「–」，改以半形「-」取代</w:t>
-      </w:r>
-    </w:p>
-    <w:p>
-      <w:pPr>
-        <w:spacing w:before="240" w:after="240"/>
+        <w:t>有任何問題可以先問我後再開始進行</w:t>
+      </w:r>
+    </w:p>
+    <w:p>
+      <w:pPr>
+        <w:pStyle w:val="a5"/>
+        <w:numPr>
+          <w:ilvl w:val="0"/>
+          <w:numId w:val="1"/>
+        </w:numPr>
+        <w:spacing w:before="240" w:after="240"/>
+        <w:ind w:leftChars="0"/>
+      </w:pPr>
+      <w:r>
         <w:rPr>
           <w:rFonts w:hint="eastAsia"/>
-          <w:sz w:val="23"/>
-          <w:szCs w:val="23"/>
-        </w:rPr>
-      </w:pPr>
-      <w:r>
+        </w:rPr>
+        <w:t>整理文獻提示詞：</w:t>
+      </w:r>
+    </w:p>
+    <w:p>
+      <w:pPr>
+        <w:pStyle w:val="a5"/>
+        <w:spacing w:before="240" w:after="240"/>
+        <w:ind w:leftChars="0" w:left="0"/>
         <w:rPr>
           <w:rFonts w:hint="eastAsia"/>
-          <w:sz w:val="23"/>
-          <w:szCs w:val="23"/>
-        </w:rPr>
-        <w:t>7.「表 4　近五年代表性實證研究之缺口矩陣」中的第一個欄位「研究文獻」內容，顯示方式請參考「肆、參考文獻」中，作者的表示方式修正</w:t>
-      </w:r>
-    </w:p>
-    <w:p>
-      <w:pPr>
-        <w:spacing w:before="240" w:after="240"/>
-        <w:rPr>
-          <w:sz w:val="23"/>
-          <w:szCs w:val="23"/>
-        </w:rPr>
-      </w:pPr>
-      <w:r>
-        <w:rPr>
-          <w:sz w:val="23"/>
-          <w:szCs w:val="23"/>
-        </w:rPr>
-        <w:t>8.</w:t>
-      </w:r>
-      <w:r>
-        <w:rPr>
-          <w:rFonts w:hint="eastAsia"/>
-          <w:sz w:val="23"/>
-          <w:szCs w:val="23"/>
-        </w:rPr>
-        <w:t>所有圖、表的順序編號以全文上下順序重新編排、並非跟隨章節編號而定，如「表</w:t>
-      </w:r>
-      <w:r>
-        <w:rPr>
-          <w:sz w:val="23"/>
-          <w:szCs w:val="23"/>
-        </w:rPr>
-        <w:t xml:space="preserve"> 4</w:t>
-      </w:r>
-      <w:r>
-        <w:rPr>
-          <w:rFonts w:hint="eastAsia"/>
-          <w:sz w:val="23"/>
-          <w:szCs w:val="23"/>
-        </w:rPr>
-        <w:t xml:space="preserve">　近五年代表性實證研究之缺口矩陣」是文中的第二張表，就應該改為「表</w:t>
-      </w:r>
-      <w:r>
-        <w:rPr>
-          <w:sz w:val="23"/>
-          <w:szCs w:val="23"/>
-        </w:rPr>
-        <w:t xml:space="preserve"> 2</w:t>
-      </w:r>
-      <w:r>
-        <w:rPr>
-          <w:rFonts w:hint="eastAsia"/>
-          <w:sz w:val="23"/>
-          <w:szCs w:val="23"/>
-        </w:rPr>
-        <w:t xml:space="preserve">　近五年代表性實證研究之缺口矩陣」才對，文案內所有其他表及圖的順序編號請一倂修正（包含本文引用的文字亦須一倂修正）</w:t>
-      </w:r>
-    </w:p>
-    <w:p>
-      <w:pPr>
-        <w:spacing w:before="240" w:after="240"/>
-        <w:rPr>
-          <w:sz w:val="23"/>
-          <w:szCs w:val="23"/>
-        </w:rPr>
-      </w:pPr>
-    </w:p>
-    <w:p>
-      <w:pPr>
-        <w:spacing w:before="240" w:after="240"/>
-        <w:rPr>
-          <w:sz w:val="23"/>
-          <w:szCs w:val="23"/>
-        </w:rPr>
-      </w:pPr>
-    </w:p>
-    <w:p>
-      <w:pPr>
-        <w:spacing w:before="240" w:after="240"/>
-        <w:rPr>
-          <w:rFonts w:hint="eastAsia"/>
-          <w:sz w:val="23"/>
-          <w:szCs w:val="23"/>
-        </w:rPr>
-      </w:pPr>
-      <w:r>
-        <w:rPr>
-          <w:rFonts w:hint="eastAsia"/>
-          <w:sz w:val="23"/>
-          <w:szCs w:val="23"/>
-        </w:rPr>
-        <w:t>再度重申所有編修的內容必須以上傳檔案：「11-1025-2335_兩年期研究計畫書-R4(OK).docx」為主，並且用螢光hightline標示所有有編修異動的內容；修改完成後重新產出新的計劃案、待下載文獻清單、各主題資料夾文獻數量及你所修改內容的重點摘要</w:t>
-      </w:r>
-    </w:p>
-    <w:p>
-      <w:pPr>
-        <w:spacing w:before="240" w:after="240"/>
-        <w:rPr>
-          <w:sz w:val="23"/>
-          <w:szCs w:val="23"/>
-        </w:rPr>
-      </w:pPr>
-    </w:p>
-    <w:p>
-      <w:pPr>
-        <w:spacing w:before="240" w:after="240"/>
-        <w:rPr>
-          <w:sz w:val="23"/>
-          <w:szCs w:val="23"/>
-        </w:rPr>
-      </w:pPr>
-      <w:r>
-        <w:rPr>
-          <w:rFonts w:hint="eastAsia"/>
-          <w:sz w:val="23"/>
-          <w:szCs w:val="23"/>
-        </w:rPr>
-        <w:t>有任何問題可以先問我後再開始進行</w:t>
-      </w:r>
-    </w:p>
-    <w:p>
-      <w:pPr>
-        <w:spacing w:before="240" w:after="240"/>
-        <w:rPr>
-          <w:sz w:val="23"/>
-          <w:szCs w:val="23"/>
-        </w:rPr>
-      </w:pPr>
-    </w:p>
-    <w:p>
-      <w:pPr>
-        <w:spacing w:before="240" w:after="240"/>
-      </w:pPr>
+        </w:rPr>
+      </w:pPr>
+      <w:r>
+        <w:t>External References資料夾內已下載文獻，比照前面的處理程序：更名、移動到適當的主題資料夾內、更新計劃書連結後、再提交並推送道遠端git，最後重新更新四份文件清單（word檔）給我</w:t>
+      </w:r>
     </w:p>
     <w:sectPr>
       <w:pgSz w:w="11909" w:h="16834"/>
@@ -1364,6 +1344,92 @@
     </w:lvl>
   </w:abstractNum>
   <w:abstractNum w:abstractNumId="2" w15:restartNumberingAfterBreak="0">
+    <w:nsid w:val="44262C35"/>
+    <w:multiLevelType w:val="hybridMultilevel"/>
+    <w:tmpl w:val="4B8EE816"/>
+    <w:lvl w:ilvl="0" w:tplc="0409000F">
+      <w:start w:val="1"/>
+      <w:numFmt w:val="decimal"/>
+      <w:lvlText w:val="%1."/>
+      <w:lvlJc w:val="left"/>
+      <w:pPr>
+        <w:ind w:left="480" w:hanging="480"/>
+      </w:pPr>
+    </w:lvl>
+    <w:lvl w:ilvl="1" w:tplc="04090019" w:tentative="1">
+      <w:start w:val="1"/>
+      <w:numFmt w:val="ideographTraditional"/>
+      <w:lvlText w:val="%2、"/>
+      <w:lvlJc w:val="left"/>
+      <w:pPr>
+        <w:ind w:left="960" w:hanging="480"/>
+      </w:pPr>
+    </w:lvl>
+    <w:lvl w:ilvl="2" w:tplc="0409001B" w:tentative="1">
+      <w:start w:val="1"/>
+      <w:numFmt w:val="lowerRoman"/>
+      <w:lvlText w:val="%3."/>
+      <w:lvlJc w:val="right"/>
+      <w:pPr>
+        <w:ind w:left="1440" w:hanging="480"/>
+      </w:pPr>
+    </w:lvl>
+    <w:lvl w:ilvl="3" w:tplc="0409000F" w:tentative="1">
+      <w:start w:val="1"/>
+      <w:numFmt w:val="decimal"/>
+      <w:lvlText w:val="%4."/>
+      <w:lvlJc w:val="left"/>
+      <w:pPr>
+        <w:ind w:left="1920" w:hanging="480"/>
+      </w:pPr>
+    </w:lvl>
+    <w:lvl w:ilvl="4" w:tplc="04090019" w:tentative="1">
+      <w:start w:val="1"/>
+      <w:numFmt w:val="ideographTraditional"/>
+      <w:lvlText w:val="%5、"/>
+      <w:lvlJc w:val="left"/>
+      <w:pPr>
+        <w:ind w:left="2400" w:hanging="480"/>
+      </w:pPr>
+    </w:lvl>
+    <w:lvl w:ilvl="5" w:tplc="0409001B" w:tentative="1">
+      <w:start w:val="1"/>
+      <w:numFmt w:val="lowerRoman"/>
+      <w:lvlText w:val="%6."/>
+      <w:lvlJc w:val="right"/>
+      <w:pPr>
+        <w:ind w:left="2880" w:hanging="480"/>
+      </w:pPr>
+    </w:lvl>
+    <w:lvl w:ilvl="6" w:tplc="0409000F" w:tentative="1">
+      <w:start w:val="1"/>
+      <w:numFmt w:val="decimal"/>
+      <w:lvlText w:val="%7."/>
+      <w:lvlJc w:val="left"/>
+      <w:pPr>
+        <w:ind w:left="3360" w:hanging="480"/>
+      </w:pPr>
+    </w:lvl>
+    <w:lvl w:ilvl="7" w:tplc="04090019" w:tentative="1">
+      <w:start w:val="1"/>
+      <w:numFmt w:val="ideographTraditional"/>
+      <w:lvlText w:val="%8、"/>
+      <w:lvlJc w:val="left"/>
+      <w:pPr>
+        <w:ind w:left="3840" w:hanging="480"/>
+      </w:pPr>
+    </w:lvl>
+    <w:lvl w:ilvl="8" w:tplc="0409001B" w:tentative="1">
+      <w:start w:val="1"/>
+      <w:numFmt w:val="lowerRoman"/>
+      <w:lvlText w:val="%9."/>
+      <w:lvlJc w:val="right"/>
+      <w:pPr>
+        <w:ind w:left="4320" w:hanging="480"/>
+      </w:pPr>
+    </w:lvl>
+  </w:abstractNum>
+  <w:abstractNum w:abstractNumId="3" w15:restartNumberingAfterBreak="0">
     <w:nsid w:val="74C2005E"/>
     <w:multiLevelType w:val="hybridMultilevel"/>
     <w:tmpl w:val="70A0372A"/>
@@ -1456,6 +1522,9 @@
     <w:abstractNumId w:val="1"/>
   </w:num>
   <w:num w:numId="3" w16cid:durableId="469639195">
+    <w:abstractNumId w:val="3"/>
+  </w:num>
+  <w:num w:numId="4" w16cid:durableId="1452550348">
     <w:abstractNumId w:val="2"/>
   </w:num>
 </w:numbering>

</xml_diff>